<commit_message>
Update relay installation scripts and documentation
Replit-Commit-Author: Agent
</commit_message>
<xml_diff>
--- a/guia_relay_instalacion.docx
+++ b/guia_relay_instalacion.docx
@@ -33,11 +33,7 @@
         <w:jc w:val="center"/>
       </w:pPr>
       <w:r>
-        <w:rPr>
-          <w:color w:val="606060"/>
-          <w:sz w:val="24"/>
-        </w:rPr>
-        <w:t>Versión 1.3 — Julio 2026</w:t>
+        <w:t>Versión 1.4 — Agosto 2026</w:t>
       </w:r>
     </w:p>
     <w:p>
@@ -283,9 +279,6 @@
         <w:pStyle w:val="Heading1"/>
       </w:pPr>
       <w:r>
-        <w:rPr>
-          <w:color w:val="1F497D"/>
-        </w:rPr>
         <w:t>2. Instalación en Linux / Raspberry Pi</w:t>
       </w:r>
     </w:p>
@@ -294,84 +287,70 @@
         <w:pStyle w:val="Heading2"/>
       </w:pPr>
       <w:r>
-        <w:rPr>
-          <w:color w:val="2E74B5"/>
-        </w:rPr>
-        <w:t>2.1 Script automático (recomendado)</w:t>
+        <w:t>2.1 Requisitos y script automático (recomendado)</w:t>
       </w:r>
     </w:p>
     <w:p>
+      <w:pPr/>
       <w:r>
-        <w:t>Un solo comando instala todo de forma interactiva: Node.js, pnpm, compilación, configuración y servicio systemd.</w:t>
+        <w:t>Este instalador está pensado para Ubuntu, Debian y Raspberry Pi OS. Debe ejecutarse con un usuario normal que tenga permisos sudo; no debe ejecutarse como root.</w:t>
       </w:r>
     </w:p>
     <w:p>
-      <w:pPr>
-        <w:pStyle w:val="NoSpacing"/>
-        <w:ind w:left="454"/>
-        <w:shd w:val="clear" w:color="auto" w:fill="F2F2F2"/>
-      </w:pPr>
+      <w:pPr/>
       <w:r>
-        <w:rPr>
-          <w:rFonts w:ascii="Courier New" w:hAnsi="Courier New"/>
-          <w:color w:val="C7254E"/>
-          <w:sz w:val="18"/>
-        </w:rPr>
-        <w:t>bash &lt;(curl -fsSL https://raw.githubusercontent.com/daycart/eqso-linux/main/artifacts/relay-daemon/install/install-relay.sh)</w:t>
-      </w:r>
-    </w:p>
-    <w:p/>
-    <w:p>
-      <w:r>
-        <w:t>El script realiza automáticamente:</w:t>
+        <w:t>Se necesita conexión a internet, una tarjeta de sonido USB para la radio y, si se desea transmisión RF automática, un cable USB-serie para PTT. El administrador debe facilitar el token del relay.</w:t>
       </w:r>
     </w:p>
     <w:p>
-      <w:pPr>
-        <w:pStyle w:val="ListBullet"/>
-      </w:pPr>
+      <w:pPr/>
       <w:r>
-        <w:t>Instala ffmpeg, git y curl vía apt si no están presentes.</w:t>
+        <w:t>La instalación directa se inicia con un solo comando:</w:t>
       </w:r>
     </w:p>
     <w:p>
       <w:pPr>
-        <w:pStyle w:val="ListBullet"/>
+        <w:pStyle w:val="NoSpacing"/>
       </w:pPr>
       <w:r>
-        <w:t>Instala pnpm y Node.js LTS en el home del usuario (sin permisos root).</w:t>
+        <w:rPr>
+          <w:rFonts w:ascii="Consolas" w:hAnsi="Consolas" w:eastAsia="Consolas"/>
+        </w:rPr>
+        <w:t>bash &lt;(curl -fsSL https://raw.githubusercontent.com/daycart/eqso-linux-client/main/artifacts/relay-daemon/install/install-relay.sh)</w:t>
       </w:r>
     </w:p>
     <w:p>
-      <w:pPr>
-        <w:pStyle w:val="ListBullet"/>
-      </w:pPr>
+      <w:pPr/>
       <w:r>
-        <w:t>Clona o actualiza el repositorio en ~/eqso-linux.</w:t>
+        <w:t>Si el repositorio ya está clonado, también puede ejecutarse desde él:</w:t>
       </w:r>
     </w:p>
     <w:p>
       <w:pPr>
-        <w:pStyle w:val="ListBullet"/>
+        <w:pStyle w:val="NoSpacing"/>
       </w:pPr>
       <w:r>
-        <w:t>Compila el relay daemon.</w:t>
+        <w:rPr>
+          <w:rFonts w:ascii="Consolas" w:hAnsi="Consolas" w:eastAsia="Consolas"/>
+        </w:rPr>
+        <w:t>git clone https://github.com/daycart/eqso-linux-client</w:t>
       </w:r>
     </w:p>
     <w:p>
       <w:pPr>
-        <w:pStyle w:val="ListBullet"/>
+        <w:pStyle w:val="NoSpacing"/>
       </w:pPr>
       <w:r>
-        <w:t>Detecta tarjetas de audio USB y puertos serie disponibles.</w:t>
+        <w:rPr>
+          <w:rFonts w:ascii="Consolas" w:hAnsi="Consolas" w:eastAsia="Consolas"/>
+        </w:rPr>
+        <w:t>bash eqso-linux-client/artifacts/relay-daemon/install/install-relay.sh</w:t>
       </w:r>
     </w:p>
     <w:p>
-      <w:pPr>
-        <w:pStyle w:val="ListBullet"/>
-      </w:pPr>
+      <w:pPr/>
       <w:r>
-        <w:t>Pregunta callsign, sala, servidor, token y dispositivos.</w:t>
+        <w:t>El instalador realiza automáticamente:</w:t>
       </w:r>
     </w:p>
     <w:p>
@@ -379,7 +358,7 @@
         <w:pStyle w:val="ListBullet"/>
       </w:pPr>
       <w:r>
-        <w:t>Crea /etc/eqso-relay/&lt;SALA&gt;.json con la configuración.</w:t>
+        <w:t>Instala vía apt ffmpeg, git, curl y alsa-utils cuando faltan. alsa-utils proporciona aplay y arecord para el audio ALSA.</w:t>
       </w:r>
     </w:p>
     <w:p>
@@ -387,92 +366,131 @@
         <w:pStyle w:val="ListBullet"/>
       </w:pPr>
       <w:r>
-        <w:t>Instala y activa el servicio systemd eqso-relay@&lt;SALA&gt;.</w:t>
-      </w:r>
-    </w:p>
-    <w:p/>
-    <w:p>
-      <w:pPr>
-        <w:pStyle w:val="Heading2"/>
-      </w:pPr>
-      <w:r>
-        <w:rPr>
-          <w:color w:val="2E74B5"/>
-        </w:rPr>
-        <w:t>2.2 Instalación manual paso a paso</w:t>
+        <w:t>Añade el usuario a los grupos audio y dialout. Si se modifican los grupos, puede ser necesario cerrar y abrir sesión.</w:t>
       </w:r>
     </w:p>
     <w:p>
       <w:pPr>
-        <w:pStyle w:val="NoSpacing"/>
-        <w:ind w:left="454"/>
-        <w:shd w:val="clear" w:color="auto" w:fill="F2F2F2"/>
+        <w:pStyle w:val="ListBullet"/>
       </w:pPr>
       <w:r>
-        <w:rPr>
-          <w:rFonts w:ascii="Courier New" w:hAnsi="Courier New"/>
-          <w:color w:val="C7254E"/>
-          <w:sz w:val="18"/>
-        </w:rPr>
-        <w:t># 1. Instalar dependencias del sistema</w:t>
+        <w:t>Instala pnpm y Node.js LTS en el directorio del usuario.</w:t>
       </w:r>
     </w:p>
     <w:p>
       <w:pPr>
-        <w:pStyle w:val="NoSpacing"/>
-        <w:ind w:left="454"/>
-        <w:shd w:val="clear" w:color="auto" w:fill="F2F2F2"/>
+        <w:pStyle w:val="ListBullet"/>
       </w:pPr>
       <w:r>
-        <w:rPr>
-          <w:rFonts w:ascii="Courier New" w:hAnsi="Courier New"/>
-          <w:color w:val="C7254E"/>
-          <w:sz w:val="18"/>
-        </w:rPr>
-        <w:t>sudo apt update &amp;&amp; sudo apt install -y ffmpeg git curl</w:t>
+        <w:t>Clona o actualiza el repositorio en ~/eqso-linux-client.</w:t>
       </w:r>
     </w:p>
     <w:p>
       <w:pPr>
-        <w:pStyle w:val="NoSpacing"/>
-        <w:ind w:left="454"/>
-        <w:shd w:val="clear" w:color="auto" w:fill="F2F2F2"/>
+        <w:pStyle w:val="ListBullet"/>
       </w:pPr>
       <w:r>
-        <w:rPr>
-          <w:rFonts w:ascii="Courier New" w:hAnsi="Courier New"/>
-          <w:color w:val="C7254E"/>
-          <w:sz w:val="18"/>
-        </w:rPr>
-        <w:t xml:space="preserve"> </w:t>
+        <w:t>Instala las dependencias y compila el relay daemon.</w:t>
       </w:r>
     </w:p>
     <w:p>
       <w:pPr>
-        <w:pStyle w:val="NoSpacing"/>
-        <w:ind w:left="454"/>
-        <w:shd w:val="clear" w:color="auto" w:fill="F2F2F2"/>
+        <w:pStyle w:val="ListBullet"/>
       </w:pPr>
       <w:r>
-        <w:rPr>
-          <w:rFonts w:ascii="Courier New" w:hAnsi="Courier New"/>
-          <w:color w:val="C7254E"/>
-          <w:sz w:val="18"/>
-        </w:rPr>
-        <w:t># 2. Instalar pnpm y Node.js LTS</w:t>
+        <w:t>Muestra las tarjetas de audio y los puertos serie disponibles.</w:t>
       </w:r>
     </w:p>
     <w:p>
       <w:pPr>
+        <w:pStyle w:val="ListBullet"/>
+      </w:pPr>
+      <w:r>
+        <w:t>Crea /etc/eqso-relay/&lt;SALA&gt;.json y configura el servicio systemd.</w:t>
+      </w:r>
+    </w:p>
+    <w:p>
+      <w:pPr>
+        <w:pStyle w:val="ListBullet"/>
+      </w:pPr>
+      <w:r>
+        <w:t>Activa y arranca eqso-relay@&lt;SALA&gt; y comprueba si queda activo.</w:t>
+      </w:r>
+    </w:p>
+    <w:p>
+      <w:pPr/>
+      <w:r>
+        <w:t>Durante las preguntas se solicita el callsign, el número de tarjeta ALSA, el puerto PTT opcional, el token, la sala, el servidor y el puerto. Los valores predeterminados son la sala CB, el servidor asorapa.sytes.net y el puerto 2172.</w:t>
+      </w:r>
+    </w:p>
+    <w:p>
+      <w:pPr>
+        <w:pStyle w:val="Heading2"/>
+      </w:pPr>
+      <w:r>
+        <w:t>2.2 Configuración de audio en Linux/Raspberry Pi</w:t>
+      </w:r>
+    </w:p>
+    <w:p>
+      <w:pPr/>
+      <w:r>
+        <w:t>El backend de Linux utiliza ALSA. La tarjeta seleccionada se convierte en un dispositivo plughw:X,0 y se utiliza tanto para capturar como para reproducir audio.</w:t>
+      </w:r>
+    </w:p>
+    <w:p>
+      <w:pPr>
         <w:pStyle w:val="NoSpacing"/>
-        <w:ind w:left="454"/>
-        <w:shd w:val="clear" w:color="auto" w:fill="F2F2F2"/>
       </w:pPr>
       <w:r>
         <w:rPr>
-          <w:rFonts w:ascii="Courier New" w:hAnsi="Courier New"/>
-          <w:color w:val="C7254E"/>
-          <w:sz w:val="18"/>
+          <w:rFonts w:ascii="Consolas" w:hAnsi="Consolas" w:eastAsia="Consolas"/>
+        </w:rPr>
+        <w:t>arecord -l    # tarjetas de captura</w:t>
+      </w:r>
+    </w:p>
+    <w:p>
+      <w:pPr>
+        <w:pStyle w:val="NoSpacing"/>
+      </w:pPr>
+      <w:r>
+        <w:rPr>
+          <w:rFonts w:ascii="Consolas" w:hAnsi="Consolas" w:eastAsia="Consolas"/>
+        </w:rPr>
+        <w:t>aplay -l      # tarjetas de reproducción</w:t>
+      </w:r>
+    </w:p>
+    <w:p>
+      <w:pPr/>
+      <w:r>
+        <w:t>En una Raspberry Pi, conecta primero la tarjeta USB y anota el número que aparece como card X. Sin cable PTT el relay puede recibir audio de la sala y reproducirlo, pero no podrá activar la transmisión RF.</w:t>
+      </w:r>
+    </w:p>
+    <w:p>
+      <w:pPr>
+        <w:pStyle w:val="Heading2"/>
+      </w:pPr>
+      <w:r>
+        <w:t>2.3 Instalación manual paso a paso</w:t>
+      </w:r>
+    </w:p>
+    <w:p>
+      <w:pPr>
+        <w:pStyle w:val="NoSpacing"/>
+      </w:pPr>
+      <w:r>
+        <w:rPr>
+          <w:rFonts w:ascii="Consolas" w:hAnsi="Consolas" w:eastAsia="Consolas"/>
+        </w:rPr>
+        <w:t>sudo apt update &amp;&amp; sudo apt install -y ffmpeg git curl alsa-utils</w:t>
+      </w:r>
+    </w:p>
+    <w:p>
+      <w:pPr>
+        <w:pStyle w:val="NoSpacing"/>
+      </w:pPr>
+      <w:r>
+        <w:rPr>
+          <w:rFonts w:ascii="Consolas" w:hAnsi="Consolas" w:eastAsia="Consolas"/>
         </w:rPr>
         <w:t>curl -fsSL https://get.pnpm.io/install.sh | sh -</w:t>
       </w:r>
@@ -480,14 +498,10 @@
     <w:p>
       <w:pPr>
         <w:pStyle w:val="NoSpacing"/>
-        <w:ind w:left="454"/>
-        <w:shd w:val="clear" w:color="auto" w:fill="F2F2F2"/>
       </w:pPr>
       <w:r>
         <w:rPr>
-          <w:rFonts w:ascii="Courier New" w:hAnsi="Courier New"/>
-          <w:color w:val="C7254E"/>
-          <w:sz w:val="18"/>
+          <w:rFonts w:ascii="Consolas" w:hAnsi="Consolas" w:eastAsia="Consolas"/>
         </w:rPr>
         <w:t>source ~/.bashrc</w:t>
       </w:r>
@@ -495,14 +509,10 @@
     <w:p>
       <w:pPr>
         <w:pStyle w:val="NoSpacing"/>
-        <w:ind w:left="454"/>
-        <w:shd w:val="clear" w:color="auto" w:fill="F2F2F2"/>
       </w:pPr>
       <w:r>
         <w:rPr>
-          <w:rFonts w:ascii="Courier New" w:hAnsi="Courier New"/>
-          <w:color w:val="C7254E"/>
-          <w:sz w:val="18"/>
+          <w:rFonts w:ascii="Consolas" w:hAnsi="Consolas" w:eastAsia="Consolas"/>
         </w:rPr>
         <w:t>pnpm env use --global lts</w:t>
       </w:r>
@@ -510,104 +520,32 @@
     <w:p>
       <w:pPr>
         <w:pStyle w:val="NoSpacing"/>
-        <w:ind w:left="454"/>
-        <w:shd w:val="clear" w:color="auto" w:fill="F2F2F2"/>
       </w:pPr>
       <w:r>
         <w:rPr>
-          <w:rFonts w:ascii="Courier New" w:hAnsi="Courier New"/>
-          <w:color w:val="C7254E"/>
-          <w:sz w:val="18"/>
+          <w:rFonts w:ascii="Consolas" w:hAnsi="Consolas" w:eastAsia="Consolas"/>
         </w:rPr>
-        <w:t xml:space="preserve"> </w:t>
+        <w:t>git clone https://github.com/daycart/eqso-linux-client</w:t>
       </w:r>
     </w:p>
     <w:p>
       <w:pPr>
         <w:pStyle w:val="NoSpacing"/>
-        <w:ind w:left="454"/>
-        <w:shd w:val="clear" w:color="auto" w:fill="F2F2F2"/>
       </w:pPr>
       <w:r>
         <w:rPr>
-          <w:rFonts w:ascii="Courier New" w:hAnsi="Courier New"/>
-          <w:color w:val="C7254E"/>
-          <w:sz w:val="18"/>
+          <w:rFonts w:ascii="Consolas" w:hAnsi="Consolas" w:eastAsia="Consolas"/>
         </w:rPr>
-        <w:t># 3. Clonar el repositorio</w:t>
+        <w:t>cd eqso-linux-client</w:t>
       </w:r>
     </w:p>
     <w:p>
       <w:pPr>
         <w:pStyle w:val="NoSpacing"/>
-        <w:ind w:left="454"/>
-        <w:shd w:val="clear" w:color="auto" w:fill="F2F2F2"/>
       </w:pPr>
       <w:r>
         <w:rPr>
-          <w:rFonts w:ascii="Courier New" w:hAnsi="Courier New"/>
-          <w:color w:val="C7254E"/>
-          <w:sz w:val="18"/>
-        </w:rPr>
-        <w:t>git clone https://github.com/daycart/eqso-linux</w:t>
-      </w:r>
-    </w:p>
-    <w:p>
-      <w:pPr>
-        <w:pStyle w:val="NoSpacing"/>
-        <w:ind w:left="454"/>
-        <w:shd w:val="clear" w:color="auto" w:fill="F2F2F2"/>
-      </w:pPr>
-      <w:r>
-        <w:rPr>
-          <w:rFonts w:ascii="Courier New" w:hAnsi="Courier New"/>
-          <w:color w:val="C7254E"/>
-          <w:sz w:val="18"/>
-        </w:rPr>
-        <w:t>cd eqso-linux</w:t>
-      </w:r>
-    </w:p>
-    <w:p>
-      <w:pPr>
-        <w:pStyle w:val="NoSpacing"/>
-        <w:ind w:left="454"/>
-        <w:shd w:val="clear" w:color="auto" w:fill="F2F2F2"/>
-      </w:pPr>
-      <w:r>
-        <w:rPr>
-          <w:rFonts w:ascii="Courier New" w:hAnsi="Courier New"/>
-          <w:color w:val="C7254E"/>
-          <w:sz w:val="18"/>
-        </w:rPr>
-        <w:t xml:space="preserve"> </w:t>
-      </w:r>
-    </w:p>
-    <w:p>
-      <w:pPr>
-        <w:pStyle w:val="NoSpacing"/>
-        <w:ind w:left="454"/>
-        <w:shd w:val="clear" w:color="auto" w:fill="F2F2F2"/>
-      </w:pPr>
-      <w:r>
-        <w:rPr>
-          <w:rFonts w:ascii="Courier New" w:hAnsi="Courier New"/>
-          <w:color w:val="C7254E"/>
-          <w:sz w:val="18"/>
-        </w:rPr>
-        <w:t># 4. Instalar dependencias y compilar</w:t>
-      </w:r>
-    </w:p>
-    <w:p>
-      <w:pPr>
-        <w:pStyle w:val="NoSpacing"/>
-        <w:ind w:left="454"/>
-        <w:shd w:val="clear" w:color="auto" w:fill="F2F2F2"/>
-      </w:pPr>
-      <w:r>
-        <w:rPr>
-          <w:rFonts w:ascii="Courier New" w:hAnsi="Courier New"/>
-          <w:color w:val="C7254E"/>
-          <w:sz w:val="18"/>
+          <w:rFonts w:ascii="Consolas" w:hAnsi="Consolas" w:eastAsia="Consolas"/>
         </w:rPr>
         <w:t>pnpm install</w:t>
       </w:r>
@@ -615,14 +553,10 @@
     <w:p>
       <w:pPr>
         <w:pStyle w:val="NoSpacing"/>
-        <w:ind w:left="454"/>
-        <w:shd w:val="clear" w:color="auto" w:fill="F2F2F2"/>
       </w:pPr>
       <w:r>
         <w:rPr>
-          <w:rFonts w:ascii="Courier New" w:hAnsi="Courier New"/>
-          <w:color w:val="C7254E"/>
-          <w:sz w:val="18"/>
+          <w:rFonts w:ascii="Consolas" w:hAnsi="Consolas" w:eastAsia="Consolas"/>
         </w:rPr>
         <w:t>pnpm --filter @workspace/relay-daemon run build</w:t>
       </w:r>
@@ -630,134 +564,43 @@
     <w:p>
       <w:pPr>
         <w:pStyle w:val="NoSpacing"/>
-        <w:ind w:left="454"/>
-        <w:shd w:val="clear" w:color="auto" w:fill="F2F2F2"/>
       </w:pPr>
       <w:r>
         <w:rPr>
-          <w:rFonts w:ascii="Courier New" w:hAnsi="Courier New"/>
-          <w:color w:val="C7254E"/>
-          <w:sz w:val="18"/>
+          <w:rFonts w:ascii="Consolas" w:hAnsi="Consolas" w:eastAsia="Consolas"/>
         </w:rPr>
-        <w:t xml:space="preserve"> </w:t>
+        <w:t>arecord -l    # identificar la tarjeta de captura</w:t>
       </w:r>
     </w:p>
     <w:p>
       <w:pPr>
         <w:pStyle w:val="NoSpacing"/>
-        <w:ind w:left="454"/>
-        <w:shd w:val="clear" w:color="auto" w:fill="F2F2F2"/>
       </w:pPr>
       <w:r>
         <w:rPr>
-          <w:rFonts w:ascii="Courier New" w:hAnsi="Courier New"/>
-          <w:color w:val="C7254E"/>
-          <w:sz w:val="18"/>
+          <w:rFonts w:ascii="Consolas" w:hAnsi="Consolas" w:eastAsia="Consolas"/>
         </w:rPr>
-        <w:t># 5. Identificar la tarjeta de audio USB</w:t>
+        <w:t>aplay -l      # identificar la tarjeta de reproducción</w:t>
       </w:r>
     </w:p>
     <w:p>
       <w:pPr>
         <w:pStyle w:val="NoSpacing"/>
-        <w:ind w:left="454"/>
-        <w:shd w:val="clear" w:color="auto" w:fill="F2F2F2"/>
       </w:pPr>
       <w:r>
         <w:rPr>
-          <w:rFonts w:ascii="Courier New" w:hAnsi="Courier New"/>
-          <w:color w:val="C7254E"/>
-          <w:sz w:val="18"/>
+          <w:rFonts w:ascii="Consolas" w:hAnsi="Consolas" w:eastAsia="Consolas"/>
         </w:rPr>
-        <w:t>aplay -l    # buscar "plughw:X,0" donde X es el número de tarjeta</w:t>
+        <w:t>ls /dev/ttyACM* /dev/ttyUSB* 2&gt;/dev/null    # identificar el PTT</w:t>
       </w:r>
     </w:p>
     <w:p>
       <w:pPr>
         <w:pStyle w:val="NoSpacing"/>
-        <w:ind w:left="454"/>
-        <w:shd w:val="clear" w:color="auto" w:fill="F2F2F2"/>
       </w:pPr>
       <w:r>
         <w:rPr>
-          <w:rFonts w:ascii="Courier New" w:hAnsi="Courier New"/>
-          <w:color w:val="C7254E"/>
-          <w:sz w:val="18"/>
-        </w:rPr>
-        <w:t xml:space="preserve"> </w:t>
-      </w:r>
-    </w:p>
-    <w:p>
-      <w:pPr>
-        <w:pStyle w:val="NoSpacing"/>
-        <w:ind w:left="454"/>
-        <w:shd w:val="clear" w:color="auto" w:fill="F2F2F2"/>
-      </w:pPr>
-      <w:r>
-        <w:rPr>
-          <w:rFonts w:ascii="Courier New" w:hAnsi="Courier New"/>
-          <w:color w:val="C7254E"/>
-          <w:sz w:val="18"/>
-        </w:rPr>
-        <w:t># 6. Identificar el puerto serie (PTT)</w:t>
-      </w:r>
-    </w:p>
-    <w:p>
-      <w:pPr>
-        <w:pStyle w:val="NoSpacing"/>
-        <w:ind w:left="454"/>
-        <w:shd w:val="clear" w:color="auto" w:fill="F2F2F2"/>
-      </w:pPr>
-      <w:r>
-        <w:rPr>
-          <w:rFonts w:ascii="Courier New" w:hAnsi="Courier New"/>
-          <w:color w:val="C7254E"/>
-          <w:sz w:val="18"/>
-        </w:rPr>
-        <w:t>ls /dev/ttyACM* /dev/ttyUSB*</w:t>
-      </w:r>
-    </w:p>
-    <w:p>
-      <w:pPr>
-        <w:pStyle w:val="NoSpacing"/>
-        <w:ind w:left="454"/>
-        <w:shd w:val="clear" w:color="auto" w:fill="F2F2F2"/>
-      </w:pPr>
-      <w:r>
-        <w:rPr>
-          <w:rFonts w:ascii="Courier New" w:hAnsi="Courier New"/>
-          <w:color w:val="C7254E"/>
-          <w:sz w:val="18"/>
-        </w:rPr>
-        <w:t xml:space="preserve"> </w:t>
-      </w:r>
-    </w:p>
-    <w:p>
-      <w:pPr>
-        <w:pStyle w:val="NoSpacing"/>
-        <w:ind w:left="454"/>
-        <w:shd w:val="clear" w:color="auto" w:fill="F2F2F2"/>
-      </w:pPr>
-      <w:r>
-        <w:rPr>
-          <w:rFonts w:ascii="Courier New" w:hAnsi="Courier New"/>
-          <w:color w:val="C7254E"/>
-          <w:sz w:val="18"/>
-        </w:rPr>
-        <w:t># 7. Crear el archivo de configuración</w:t>
-      </w:r>
-    </w:p>
-    <w:p>
-      <w:pPr>
-        <w:pStyle w:val="NoSpacing"/>
-        <w:ind w:left="454"/>
-        <w:shd w:val="clear" w:color="auto" w:fill="F2F2F2"/>
-      </w:pPr>
-      <w:r>
-        <w:rPr>
-          <w:rFonts w:ascii="Courier New" w:hAnsi="Courier New"/>
-          <w:color w:val="C7254E"/>
-          <w:sz w:val="18"/>
+          <w:rFonts w:ascii="Consolas" w:hAnsi="Consolas" w:eastAsia="Consolas"/>
         </w:rPr>
         <w:t>sudo mkdir -p /etc/eqso-relay</w:t>
       </w:r>
@@ -765,14 +608,10 @@
     <w:p>
       <w:pPr>
         <w:pStyle w:val="NoSpacing"/>
-        <w:ind w:left="454"/>
-        <w:shd w:val="clear" w:color="auto" w:fill="F2F2F2"/>
       </w:pPr>
       <w:r>
         <w:rPr>
-          <w:rFonts w:ascii="Courier New" w:hAnsi="Courier New"/>
-          <w:color w:val="C7254E"/>
-          <w:sz w:val="18"/>
+          <w:rFonts w:ascii="Consolas" w:hAnsi="Consolas" w:eastAsia="Consolas"/>
         </w:rPr>
         <w:t>sudo cp artifacts/relay-daemon/install/config.example.json /etc/eqso-relay/CB.json</w:t>
       </w:r>
@@ -780,14 +619,10 @@
     <w:p>
       <w:pPr>
         <w:pStyle w:val="NoSpacing"/>
-        <w:ind w:left="454"/>
-        <w:shd w:val="clear" w:color="auto" w:fill="F2F2F2"/>
       </w:pPr>
       <w:r>
         <w:rPr>
-          <w:rFonts w:ascii="Courier New" w:hAnsi="Courier New"/>
-          <w:color w:val="C7254E"/>
-          <w:sz w:val="18"/>
+          <w:rFonts w:ascii="Consolas" w:hAnsi="Consolas" w:eastAsia="Consolas"/>
         </w:rPr>
         <w:t>sudo nano /etc/eqso-relay/CB.json</w:t>
       </w:r>
@@ -795,44 +630,10 @@
     <w:p>
       <w:pPr>
         <w:pStyle w:val="NoSpacing"/>
-        <w:ind w:left="454"/>
-        <w:shd w:val="clear" w:color="auto" w:fill="F2F2F2"/>
       </w:pPr>
       <w:r>
         <w:rPr>
-          <w:rFonts w:ascii="Courier New" w:hAnsi="Courier New"/>
-          <w:color w:val="C7254E"/>
-          <w:sz w:val="18"/>
-        </w:rPr>
-        <w:t xml:space="preserve"> </w:t>
-      </w:r>
-    </w:p>
-    <w:p>
-      <w:pPr>
-        <w:pStyle w:val="NoSpacing"/>
-        <w:ind w:left="454"/>
-        <w:shd w:val="clear" w:color="auto" w:fill="F2F2F2"/>
-      </w:pPr>
-      <w:r>
-        <w:rPr>
-          <w:rFonts w:ascii="Courier New" w:hAnsi="Courier New"/>
-          <w:color w:val="C7254E"/>
-          <w:sz w:val="18"/>
-        </w:rPr>
-        <w:t># 8. Instalar el servicio systemd</w:t>
-      </w:r>
-    </w:p>
-    <w:p>
-      <w:pPr>
-        <w:pStyle w:val="NoSpacing"/>
-        <w:ind w:left="454"/>
-        <w:shd w:val="clear" w:color="auto" w:fill="F2F2F2"/>
-      </w:pPr>
-      <w:r>
-        <w:rPr>
-          <w:rFonts w:ascii="Courier New" w:hAnsi="Courier New"/>
-          <w:color w:val="C7254E"/>
-          <w:sz w:val="18"/>
+          <w:rFonts w:ascii="Consolas" w:hAnsi="Consolas" w:eastAsia="Consolas"/>
         </w:rPr>
         <w:t>sudo cp artifacts/relay-daemon/install/eqso-relay@.service /etc/systemd/system/</w:t>
       </w:r>
@@ -840,14 +641,10 @@
     <w:p>
       <w:pPr>
         <w:pStyle w:val="NoSpacing"/>
-        <w:ind w:left="454"/>
-        <w:shd w:val="clear" w:color="auto" w:fill="F2F2F2"/>
       </w:pPr>
       <w:r>
         <w:rPr>
-          <w:rFonts w:ascii="Courier New" w:hAnsi="Courier New"/>
-          <w:color w:val="C7254E"/>
-          <w:sz w:val="18"/>
+          <w:rFonts w:ascii="Consolas" w:hAnsi="Consolas" w:eastAsia="Consolas"/>
         </w:rPr>
         <w:t>sudo systemctl daemon-reload</w:t>
       </w:r>
@@ -855,101 +652,40 @@
     <w:p>
       <w:pPr>
         <w:pStyle w:val="NoSpacing"/>
-        <w:ind w:left="454"/>
-        <w:shd w:val="clear" w:color="auto" w:fill="F2F2F2"/>
       </w:pPr>
       <w:r>
         <w:rPr>
-          <w:rFonts w:ascii="Courier New" w:hAnsi="Courier New"/>
-          <w:color w:val="C7254E"/>
-          <w:sz w:val="18"/>
+          <w:rFonts w:ascii="Consolas" w:hAnsi="Consolas" w:eastAsia="Consolas"/>
         </w:rPr>
         <w:t>sudo systemctl enable --now eqso-relay@CB</w:t>
       </w:r>
     </w:p>
     <w:p>
       <w:pPr>
-        <w:pStyle w:val="NoSpacing"/>
-        <w:ind w:left="454"/>
-        <w:shd w:val="clear" w:color="auto" w:fill="F2F2F2"/>
+        <w:pStyle w:val="Heading2"/>
       </w:pPr>
       <w:r>
-        <w:rPr>
-          <w:rFonts w:ascii="Courier New" w:hAnsi="Courier New"/>
-          <w:color w:val="C7254E"/>
-          <w:sz w:val="18"/>
-        </w:rPr>
-        <w:t xml:space="preserve"> </w:t>
+        <w:t>2.4 Actualizar y administrar el servicio Linux/Raspberry Pi</w:t>
       </w:r>
     </w:p>
     <w:p>
       <w:pPr>
         <w:pStyle w:val="NoSpacing"/>
-        <w:ind w:left="454"/>
-        <w:shd w:val="clear" w:color="auto" w:fill="F2F2F2"/>
       </w:pPr>
       <w:r>
         <w:rPr>
-          <w:rFonts w:ascii="Courier New" w:hAnsi="Courier New"/>
-          <w:color w:val="C7254E"/>
-          <w:sz w:val="18"/>
+          <w:rFonts w:ascii="Consolas" w:hAnsi="Consolas" w:eastAsia="Consolas"/>
         </w:rPr>
-        <w:t># 9. Ver logs en tiempo real</w:t>
+        <w:t>cd ~/eqso-linux-client</w:t>
       </w:r>
     </w:p>
     <w:p>
       <w:pPr>
         <w:pStyle w:val="NoSpacing"/>
-        <w:ind w:left="454"/>
-        <w:shd w:val="clear" w:color="auto" w:fill="F2F2F2"/>
       </w:pPr>
       <w:r>
         <w:rPr>
-          <w:rFonts w:ascii="Courier New" w:hAnsi="Courier New"/>
-          <w:color w:val="C7254E"/>
-          <w:sz w:val="18"/>
-        </w:rPr>
-        <w:t>sudo journalctl -u eqso-relay@CB -f</w:t>
-      </w:r>
-    </w:p>
-    <w:p/>
-    <w:p>
-      <w:pPr>
-        <w:pStyle w:val="Heading2"/>
-      </w:pPr>
-      <w:r>
-        <w:rPr>
-          <w:color w:val="2E74B5"/>
-        </w:rPr>
-        <w:t>2.3 Actualizar a nueva versión</w:t>
-      </w:r>
-    </w:p>
-    <w:p>
-      <w:pPr>
-        <w:pStyle w:val="NoSpacing"/>
-        <w:ind w:left="454"/>
-        <w:shd w:val="clear" w:color="auto" w:fill="F2F2F2"/>
-      </w:pPr>
-      <w:r>
-        <w:rPr>
-          <w:rFonts w:ascii="Courier New" w:hAnsi="Courier New"/>
-          <w:color w:val="C7254E"/>
-          <w:sz w:val="18"/>
-        </w:rPr>
-        <w:t>cd ~/eqso-linux</w:t>
-      </w:r>
-    </w:p>
-    <w:p>
-      <w:pPr>
-        <w:pStyle w:val="NoSpacing"/>
-        <w:ind w:left="454"/>
-        <w:shd w:val="clear" w:color="auto" w:fill="F2F2F2"/>
-      </w:pPr>
-      <w:r>
-        <w:rPr>
-          <w:rFonts w:ascii="Courier New" w:hAnsi="Courier New"/>
-          <w:color w:val="C7254E"/>
-          <w:sz w:val="18"/>
+          <w:rFonts w:ascii="Consolas" w:hAnsi="Consolas" w:eastAsia="Consolas"/>
         </w:rPr>
         <w:t>git pull</w:t>
       </w:r>
@@ -957,14 +693,10 @@
     <w:p>
       <w:pPr>
         <w:pStyle w:val="NoSpacing"/>
-        <w:ind w:left="454"/>
-        <w:shd w:val="clear" w:color="auto" w:fill="F2F2F2"/>
       </w:pPr>
       <w:r>
         <w:rPr>
-          <w:rFonts w:ascii="Courier New" w:hAnsi="Courier New"/>
-          <w:color w:val="C7254E"/>
-          <w:sz w:val="18"/>
+          <w:rFonts w:ascii="Consolas" w:hAnsi="Consolas" w:eastAsia="Consolas"/>
         </w:rPr>
         <w:t>pnpm install</w:t>
       </w:r>
@@ -972,14 +704,10 @@
     <w:p>
       <w:pPr>
         <w:pStyle w:val="NoSpacing"/>
-        <w:ind w:left="454"/>
-        <w:shd w:val="clear" w:color="auto" w:fill="F2F2F2"/>
       </w:pPr>
       <w:r>
         <w:rPr>
-          <w:rFonts w:ascii="Courier New" w:hAnsi="Courier New"/>
-          <w:color w:val="C7254E"/>
-          <w:sz w:val="18"/>
+          <w:rFonts w:ascii="Consolas" w:hAnsi="Consolas" w:eastAsia="Consolas"/>
         </w:rPr>
         <w:t>pnpm --filter @workspace/relay-daemon run build</w:t>
       </w:r>
@@ -987,31 +715,80 @@
     <w:p>
       <w:pPr>
         <w:pStyle w:val="NoSpacing"/>
-        <w:ind w:left="454"/>
-        <w:shd w:val="clear" w:color="auto" w:fill="F2F2F2"/>
       </w:pPr>
       <w:r>
         <w:rPr>
-          <w:rFonts w:ascii="Courier New" w:hAnsi="Courier New"/>
-          <w:color w:val="C7254E"/>
-          <w:sz w:val="18"/>
+          <w:rFonts w:ascii="Consolas" w:hAnsi="Consolas" w:eastAsia="Consolas"/>
         </w:rPr>
         <w:t>sudo systemctl restart eqso-relay@CB</w:t>
       </w:r>
     </w:p>
     <w:p>
+      <w:pPr/>
       <w:r>
-        <w:br w:type="page"/>
+        <w:t>La configuración está en /etc/eqso-relay/CB.json. Después de modificarla, reinicia el servicio para aplicar los cambios.</w:t>
       </w:r>
     </w:p>
     <w:p>
       <w:pPr>
-        <w:pStyle w:val="Heading1"/>
+        <w:pStyle w:val="NoSpacing"/>
       </w:pPr>
       <w:r>
         <w:rPr>
-          <w:color w:val="1F497D"/>
+          <w:rFonts w:ascii="Consolas" w:hAnsi="Consolas" w:eastAsia="Consolas"/>
         </w:rPr>
+        <w:t>sudo systemctl status eqso-relay@CB</w:t>
+      </w:r>
+    </w:p>
+    <w:p>
+      <w:pPr>
+        <w:pStyle w:val="NoSpacing"/>
+      </w:pPr>
+      <w:r>
+        <w:rPr>
+          <w:rFonts w:ascii="Consolas" w:hAnsi="Consolas" w:eastAsia="Consolas"/>
+        </w:rPr>
+        <w:t>sudo journalctl -u eqso-relay@CB -f</w:t>
+      </w:r>
+    </w:p>
+    <w:p>
+      <w:pPr>
+        <w:pStyle w:val="NoSpacing"/>
+      </w:pPr>
+      <w:r>
+        <w:rPr>
+          <w:rFonts w:ascii="Consolas" w:hAnsi="Consolas" w:eastAsia="Consolas"/>
+        </w:rPr>
+        <w:t>sudo systemctl stop eqso-relay@CB</w:t>
+      </w:r>
+    </w:p>
+    <w:p>
+      <w:pPr>
+        <w:pStyle w:val="NoSpacing"/>
+      </w:pPr>
+      <w:r>
+        <w:rPr>
+          <w:rFonts w:ascii="Consolas" w:hAnsi="Consolas" w:eastAsia="Consolas"/>
+        </w:rPr>
+        <w:t>sudo systemctl restart eqso-relay@CB</w:t>
+      </w:r>
+    </w:p>
+    <w:p>
+      <w:pPr>
+        <w:pStyle w:val="NoSpacing"/>
+      </w:pPr>
+      <w:r>
+        <w:rPr>
+          <w:rFonts w:ascii="Consolas" w:hAnsi="Consolas" w:eastAsia="Consolas"/>
+        </w:rPr>
+        <w:t>curl http://127.0.0.1:8009/status</w:t>
+      </w:r>
+    </w:p>
+    <w:p>
+      <w:pPr>
+        <w:pStyle w:val="Heading1"/>
+      </w:pPr>
+      <w:r>
         <w:t>3. Instalación en Windows 10/11</w:t>
       </w:r>
     </w:p>
@@ -1020,84 +797,67 @@
         <w:pStyle w:val="Heading2"/>
       </w:pPr>
       <w:r>
-        <w:rPr>
-          <w:color w:val="2E74B5"/>
-        </w:rPr>
-        <w:t>3.1 Script automático PowerShell (recomendado)</w:t>
+        <w:t>3.1 Lanzador de doble clic (recomendado)</w:t>
       </w:r>
     </w:p>
     <w:p>
+      <w:pPr/>
       <w:r>
-        <w:t>Abrir PowerShell como Administrador y ejecutar:</w:t>
+        <w:t>Descarga install-relay-windows.cmd desde la carpeta de instalación del repositorio:</w:t>
       </w:r>
     </w:p>
     <w:p>
       <w:pPr>
         <w:pStyle w:val="NoSpacing"/>
-        <w:ind w:left="454"/>
-        <w:shd w:val="clear" w:color="auto" w:fill="F2F2F2"/>
       </w:pPr>
       <w:r>
         <w:rPr>
-          <w:rFonts w:ascii="Courier New" w:hAnsi="Courier New"/>
-          <w:color w:val="C7254E"/>
-          <w:sz w:val="18"/>
+          <w:rFonts w:ascii="Consolas" w:hAnsi="Consolas" w:eastAsia="Consolas"/>
         </w:rPr>
-        <w:t>irm https://raw.githubusercontent.com/daycart/eqso-linux/main/artifacts/relay-daemon/install/install-relay.ps1 | iex</w:t>
-      </w:r>
-    </w:p>
-    <w:p/>
-    <w:p>
-      <w:r>
-        <w:t>El script realiza automáticamente:</w:t>
+        <w:t>https://github.com/daycart/eqso-linux/tree/test/windows-relay-installer/artifacts/relay-daemon/install</w:t>
       </w:r>
     </w:p>
     <w:p>
-      <w:pPr>
-        <w:pStyle w:val="ListBullet"/>
-      </w:pPr>
+      <w:pPr/>
       <w:r>
-        <w:t>Instala git, Node.js LTS y ffmpeg vía winget si no están presentes.</w:t>
+        <w:t>Abre el archivo con doble clic. El lanzador solicita permisos de Administrador, utiliza install-relay.ps1 si está en la misma carpeta y, si se descarga solo, obtiene el script automáticamente desde GitHub. No es necesario escribir comandos en PowerShell.</w:t>
       </w:r>
     </w:p>
     <w:p>
-      <w:pPr>
-        <w:pStyle w:val="ListBullet"/>
-      </w:pPr>
+      <w:pPr/>
       <w:r>
-        <w:t>Instala pnpm vía npm.</w:t>
+        <w:t>Si el navegador guarda el archivo como install-relay-windows.cmd.txt, activa Ver → Mostrar → Extensiones de nombre de archivo en el Explorador y renómbralo para que termine exactamente en .cmd. También se pueden descargar ambos archivos juntos desde la carpeta del repositorio.</w:t>
       </w:r>
     </w:p>
     <w:p>
-      <w:pPr>
-        <w:pStyle w:val="ListBullet"/>
-      </w:pPr>
+      <w:pPr/>
       <w:r>
-        <w:t>Clona o actualiza el repositorio en %USERPROFILE%\eqso-linux.</w:t>
+        <w:t>Como alternativa, puede ejecutarse PowerShell como Administrador con:</w:t>
       </w:r>
     </w:p>
     <w:p>
       <w:pPr>
-        <w:pStyle w:val="ListBullet"/>
+        <w:pStyle w:val="NoSpacing"/>
       </w:pPr>
       <w:r>
-        <w:t>Compila el relay daemon (backend ffmpeg para Windows).</w:t>
+        <w:rPr>
+          <w:rFonts w:ascii="Consolas" w:hAnsi="Consolas" w:eastAsia="Consolas"/>
+        </w:rPr>
+        <w:t>irm https://raw.githubusercontent.com/daycart/eqso-linux/test/windows-relay-installer/artifacts/relay-daemon/install/install-relay.ps1 | iex</w:t>
       </w:r>
     </w:p>
     <w:p>
       <w:pPr>
-        <w:pStyle w:val="ListBullet"/>
+        <w:pStyle w:val="Heading2"/>
       </w:pPr>
       <w:r>
-        <w:t>Lista los dispositivos de audio dshow y puertos COM disponibles.</w:t>
+        <w:t>3.2 Modos PC físico y máquina virtual</w:t>
       </w:r>
     </w:p>
     <w:p>
-      <w:pPr>
-        <w:pStyle w:val="ListBullet"/>
-      </w:pPr>
+      <w:pPr/>
       <w:r>
-        <w:t>Pregunta callsign, sala, servidor, token y dispositivos.</w:t>
+        <w:t>Al comenzar, el instalador pregunta el tipo de equipo. La opción predeterminada es la máquina virtual para evitar abrir dispositivos de audio accidentalmente.</w:t>
       </w:r>
     </w:p>
     <w:p>
@@ -1105,7 +865,7 @@
         <w:pStyle w:val="ListBullet"/>
       </w:pPr>
       <w:r>
-        <w:t>Crea C:\eqso-relay\&lt;SALA&gt;.json con la configuración.</w:t>
+        <w:t>PC físico — seleccionar 1: instala las dependencias con winget, compila, prueba la captura DirectShow y la reproducción FFplay, arranca el relay y activa el inicio automático de sesión.</w:t>
       </w:r>
     </w:p>
     <w:p>
@@ -1113,47 +873,100 @@
         <w:pStyle w:val="ListBullet"/>
       </w:pPr>
       <w:r>
-        <w:t>Registra una tarea programada de Windows que arranca el relay al iniciar sesión y se reinicia si falla.</w:t>
-      </w:r>
-    </w:p>
-    <w:p/>
-    <w:p>
-      <w:pPr>
-        <w:pStyle w:val="Heading2"/>
-      </w:pPr>
-      <w:r>
-        <w:rPr>
-          <w:color w:val="2E74B5"/>
-        </w:rPr>
-        <w:t>3.2 Comandos de gestión en Windows</w:t>
+        <w:t>Máquina virtual — seleccionar 2: instala y configura, pero no abre los dispositivos de audio, no arranca el relay y deja desactivado el inicio automático. Es el modo recomendado para VirtualBox con passthrough USB.</w:t>
       </w:r>
     </w:p>
     <w:p>
-      <w:pPr>
-        <w:pStyle w:val="NoSpacing"/>
-        <w:ind w:left="454"/>
-        <w:shd w:val="clear" w:color="auto" w:fill="F2F2F2"/>
-      </w:pPr>
+      <w:pPr/>
       <w:r>
-        <w:rPr>
-          <w:rFonts w:ascii="Courier New" w:hAnsi="Courier New"/>
-          <w:color w:val="C7254E"/>
-          <w:sz w:val="18"/>
-        </w:rPr>
-        <w:t># Ver logs en tiempo real</w:t>
+        <w:t>Windows utiliza DirectShow para capturar y FFplay/SDL para reproducir. La entrada y la salida de audio se seleccionan por separado. No se debe utilizar wasapi como formato de salida de FFmpeg.</w:t>
       </w:r>
     </w:p>
     <w:p>
       <w:pPr>
+        <w:pStyle w:val="Heading2"/>
+      </w:pPr>
+      <w:r>
+        <w:t>3.3 Qué instala y configura el instalador Windows</w:t>
+      </w:r>
+    </w:p>
+    <w:p>
+      <w:pPr>
+        <w:pStyle w:val="ListBullet"/>
+      </w:pPr>
+      <w:r>
+        <w:t>Instala Git, Node.js LTS y FFmpeg/FFplay mediante winget si no están disponibles.</w:t>
+      </w:r>
+    </w:p>
+    <w:p>
+      <w:pPr>
+        <w:pStyle w:val="ListBullet"/>
+      </w:pPr>
+      <w:r>
+        <w:t>Clona o actualiza el repositorio en %USERPROFILE%\eqso-linux y compila el relay daemon.</w:t>
+      </w:r>
+    </w:p>
+    <w:p>
+      <w:pPr>
+        <w:pStyle w:val="ListBullet"/>
+      </w:pPr>
+      <w:r>
+        <w:t>Lista las entradas DirectShow, las salidas de audio Windows y los puertos COM.</w:t>
+      </w:r>
+    </w:p>
+    <w:p>
+      <w:pPr>
+        <w:pStyle w:val="ListBullet"/>
+      </w:pPr>
+      <w:r>
+        <w:t>Solicita callsign, entrada de captura, salida de reproducción, puerto PTT, token, sala, servidor y puerto.</w:t>
+      </w:r>
+    </w:p>
+    <w:p>
+      <w:pPr>
+        <w:pStyle w:val="ListBullet"/>
+      </w:pPr>
+      <w:r>
+        <w:t>Genera C:\eqso-relay\&lt;SALA&gt;.json en UTF-8 sin BOM y valida el JSON.</w:t>
+      </w:r>
+    </w:p>
+    <w:p>
+      <w:pPr>
+        <w:pStyle w:val="ListBullet"/>
+      </w:pPr>
+      <w:r>
+        <w:t>Crea C:\eqso-relay\start-&lt;SALA&gt;.cmd y la tarea programada eQSO Relay &lt;SALA&gt;.</w:t>
+      </w:r>
+    </w:p>
+    <w:p>
+      <w:pPr>
+        <w:pStyle w:val="ListBullet"/>
+      </w:pPr>
+      <w:r>
+        <w:t>La tarea se reinicia automáticamente si el proceso falla. En PC físico se inicia inmediatamente; en VM queda registrada pero detenida.</w:t>
+      </w:r>
+    </w:p>
+    <w:p>
+      <w:pPr>
+        <w:pStyle w:val="Heading2"/>
+      </w:pPr>
+      <w:r>
+        <w:t>3.4 Administración y actualización en Windows</w:t>
+      </w:r>
+    </w:p>
+    <w:p>
+      <w:pPr/>
+      <w:r>
+        <w:t>El log de la tarea se guarda en C:\eqso-relay\relay-&lt;SALA&gt;.log. Sustituye CB por el nombre real de la sala.</w:t>
+      </w:r>
+    </w:p>
+    <w:p>
+      <w:pPr>
         <w:pStyle w:val="NoSpacing"/>
-        <w:ind w:left="454"/>
-        <w:shd w:val="clear" w:color="auto" w:fill="F2F2F2"/>
       </w:pPr>
       <w:r>
         <w:rPr>
-          <w:rFonts w:ascii="Courier New" w:hAnsi="Courier New"/>
-          <w:color w:val="C7254E"/>
-          <w:sz w:val="18"/>
+          <w:rFonts w:ascii="Consolas" w:hAnsi="Consolas" w:eastAsia="Consolas"/>
         </w:rPr>
         <w:t>Get-Content "C:\eqso-relay\relay-CB.log" -Wait -Tail 20</w:t>
       </w:r>
@@ -1161,89 +974,21 @@
     <w:p>
       <w:pPr>
         <w:pStyle w:val="NoSpacing"/>
-        <w:ind w:left="454"/>
-        <w:shd w:val="clear" w:color="auto" w:fill="F2F2F2"/>
       </w:pPr>
       <w:r>
         <w:rPr>
-          <w:rFonts w:ascii="Courier New" w:hAnsi="Courier New"/>
-          <w:color w:val="C7254E"/>
-          <w:sz w:val="18"/>
+          <w:rFonts w:ascii="Consolas" w:hAnsi="Consolas" w:eastAsia="Consolas"/>
         </w:rPr>
-        <w:t xml:space="preserve"> </w:t>
+        <w:t>Stop-ScheduledTask -TaskName "eQSO Relay CB"</w:t>
       </w:r>
     </w:p>
     <w:p>
       <w:pPr>
         <w:pStyle w:val="NoSpacing"/>
-        <w:ind w:left="454"/>
-        <w:shd w:val="clear" w:color="auto" w:fill="F2F2F2"/>
       </w:pPr>
       <w:r>
         <w:rPr>
-          <w:rFonts w:ascii="Courier New" w:hAnsi="Courier New"/>
-          <w:color w:val="C7254E"/>
-          <w:sz w:val="18"/>
-        </w:rPr>
-        <w:t># Parar el relay</w:t>
-      </w:r>
-    </w:p>
-    <w:p>
-      <w:pPr>
-        <w:pStyle w:val="NoSpacing"/>
-        <w:ind w:left="454"/>
-        <w:shd w:val="clear" w:color="auto" w:fill="F2F2F2"/>
-      </w:pPr>
-      <w:r>
-        <w:rPr>
-          <w:rFonts w:ascii="Courier New" w:hAnsi="Courier New"/>
-          <w:color w:val="C7254E"/>
-          <w:sz w:val="18"/>
-        </w:rPr>
-        <w:t>Stop-ScheduledTask  -TaskName "eQSO Relay CB"</w:t>
-      </w:r>
-    </w:p>
-    <w:p>
-      <w:pPr>
-        <w:pStyle w:val="NoSpacing"/>
-        <w:ind w:left="454"/>
-        <w:shd w:val="clear" w:color="auto" w:fill="F2F2F2"/>
-      </w:pPr>
-      <w:r>
-        <w:rPr>
-          <w:rFonts w:ascii="Courier New" w:hAnsi="Courier New"/>
-          <w:color w:val="C7254E"/>
-          <w:sz w:val="18"/>
-        </w:rPr>
-        <w:t xml:space="preserve"> </w:t>
-      </w:r>
-    </w:p>
-    <w:p>
-      <w:pPr>
-        <w:pStyle w:val="NoSpacing"/>
-        <w:ind w:left="454"/>
-        <w:shd w:val="clear" w:color="auto" w:fill="F2F2F2"/>
-      </w:pPr>
-      <w:r>
-        <w:rPr>
-          <w:rFonts w:ascii="Courier New" w:hAnsi="Courier New"/>
-          <w:color w:val="C7254E"/>
-          <w:sz w:val="18"/>
-        </w:rPr>
-        <w:t># Arrancar el relay</w:t>
-      </w:r>
-    </w:p>
-    <w:p>
-      <w:pPr>
-        <w:pStyle w:val="NoSpacing"/>
-        <w:ind w:left="454"/>
-        <w:shd w:val="clear" w:color="auto" w:fill="F2F2F2"/>
-      </w:pPr>
-      <w:r>
-        <w:rPr>
-          <w:rFonts w:ascii="Courier New" w:hAnsi="Courier New"/>
-          <w:color w:val="C7254E"/>
-          <w:sz w:val="18"/>
+          <w:rFonts w:ascii="Consolas" w:hAnsi="Consolas" w:eastAsia="Consolas"/>
         </w:rPr>
         <w:t>Start-ScheduledTask -TaskName "eQSO Relay CB"</w:t>
       </w:r>
@@ -1251,198 +996,29 @@
     <w:p>
       <w:pPr>
         <w:pStyle w:val="NoSpacing"/>
-        <w:ind w:left="454"/>
-        <w:shd w:val="clear" w:color="auto" w:fill="F2F2F2"/>
       </w:pPr>
       <w:r>
         <w:rPr>
-          <w:rFonts w:ascii="Courier New" w:hAnsi="Courier New"/>
-          <w:color w:val="C7254E"/>
-          <w:sz w:val="18"/>
+          <w:rFonts w:ascii="Consolas" w:hAnsi="Consolas" w:eastAsia="Consolas"/>
         </w:rPr>
-        <w:t xml:space="preserve"> </w:t>
+        <w:t>Stop-ScheduledTask -TaskName "eQSO Relay CB"; Start-ScheduledTask -TaskName "eQSO Relay CB"</w:t>
       </w:r>
     </w:p>
     <w:p>
       <w:pPr>
         <w:pStyle w:val="NoSpacing"/>
-        <w:ind w:left="454"/>
-        <w:shd w:val="clear" w:color="auto" w:fill="F2F2F2"/>
       </w:pPr>
       <w:r>
         <w:rPr>
-          <w:rFonts w:ascii="Courier New" w:hAnsi="Courier New"/>
-          <w:color w:val="C7254E"/>
-          <w:sz w:val="18"/>
-        </w:rPr>
-        <w:t># Desinstalar</w:t>
-      </w:r>
-    </w:p>
-    <w:p>
-      <w:pPr>
-        <w:pStyle w:val="NoSpacing"/>
-        <w:ind w:left="454"/>
-        <w:shd w:val="clear" w:color="auto" w:fill="F2F2F2"/>
-      </w:pPr>
-      <w:r>
-        <w:rPr>
-          <w:rFonts w:ascii="Courier New" w:hAnsi="Courier New"/>
-          <w:color w:val="C7254E"/>
-          <w:sz w:val="18"/>
+          <w:rFonts w:ascii="Consolas" w:hAnsi="Consolas" w:eastAsia="Consolas"/>
         </w:rPr>
         <w:t>Unregister-ScheduledTask -TaskName "eQSO Relay CB" -Confirm:$false</w:t>
       </w:r>
     </w:p>
     <w:p>
-      <w:pPr>
-        <w:pStyle w:val="NoSpacing"/>
-        <w:ind w:left="454"/>
-        <w:shd w:val="clear" w:color="auto" w:fill="F2F2F2"/>
-      </w:pPr>
+      <w:pPr/>
       <w:r>
-        <w:rPr>
-          <w:rFonts w:ascii="Courier New" w:hAnsi="Courier New"/>
-          <w:color w:val="C7254E"/>
-          <w:sz w:val="18"/>
-        </w:rPr>
-        <w:t xml:space="preserve"> </w:t>
-      </w:r>
-    </w:p>
-    <w:p>
-      <w:pPr>
-        <w:pStyle w:val="NoSpacing"/>
-        <w:ind w:left="454"/>
-        <w:shd w:val="clear" w:color="auto" w:fill="F2F2F2"/>
-      </w:pPr>
-      <w:r>
-        <w:rPr>
-          <w:rFonts w:ascii="Courier New" w:hAnsi="Courier New"/>
-          <w:color w:val="C7254E"/>
-          <w:sz w:val="18"/>
-        </w:rPr>
-        <w:t># Listar dispositivos de audio disponibles</w:t>
-      </w:r>
-    </w:p>
-    <w:p>
-      <w:pPr>
-        <w:pStyle w:val="NoSpacing"/>
-        <w:ind w:left="454"/>
-        <w:shd w:val="clear" w:color="auto" w:fill="F2F2F2"/>
-      </w:pPr>
-      <w:r>
-        <w:rPr>
-          <w:rFonts w:ascii="Courier New" w:hAnsi="Courier New"/>
-          <w:color w:val="C7254E"/>
-          <w:sz w:val="18"/>
-        </w:rPr>
-        <w:t>ffmpeg -list_devices true -f dshow -i dummy</w:t>
-      </w:r>
-    </w:p>
-    <w:p/>
-    <w:p>
-      <w:pPr>
-        <w:pStyle w:val="Heading2"/>
-      </w:pPr>
-      <w:r>
-        <w:rPr>
-          <w:color w:val="2E74B5"/>
-        </w:rPr>
-        <w:t>3.3 Actualizar a nueva versión</w:t>
-      </w:r>
-    </w:p>
-    <w:p>
-      <w:pPr>
-        <w:pStyle w:val="NoSpacing"/>
-        <w:ind w:left="454"/>
-        <w:shd w:val="clear" w:color="auto" w:fill="F2F2F2"/>
-      </w:pPr>
-      <w:r>
-        <w:rPr>
-          <w:rFonts w:ascii="Courier New" w:hAnsi="Courier New"/>
-          <w:color w:val="C7254E"/>
-          <w:sz w:val="18"/>
-        </w:rPr>
-        <w:t>cd $env:USERPROFILE\eqso-linux</w:t>
-      </w:r>
-    </w:p>
-    <w:p>
-      <w:pPr>
-        <w:pStyle w:val="NoSpacing"/>
-        <w:ind w:left="454"/>
-        <w:shd w:val="clear" w:color="auto" w:fill="F2F2F2"/>
-      </w:pPr>
-      <w:r>
-        <w:rPr>
-          <w:rFonts w:ascii="Courier New" w:hAnsi="Courier New"/>
-          <w:color w:val="C7254E"/>
-          <w:sz w:val="18"/>
-        </w:rPr>
-        <w:t>git pull</w:t>
-      </w:r>
-    </w:p>
-    <w:p>
-      <w:pPr>
-        <w:pStyle w:val="NoSpacing"/>
-        <w:ind w:left="454"/>
-        <w:shd w:val="clear" w:color="auto" w:fill="F2F2F2"/>
-      </w:pPr>
-      <w:r>
-        <w:rPr>
-          <w:rFonts w:ascii="Courier New" w:hAnsi="Courier New"/>
-          <w:color w:val="C7254E"/>
-          <w:sz w:val="18"/>
-        </w:rPr>
-        <w:t>pnpm install</w:t>
-      </w:r>
-    </w:p>
-    <w:p>
-      <w:pPr>
-        <w:pStyle w:val="NoSpacing"/>
-        <w:ind w:left="454"/>
-        <w:shd w:val="clear" w:color="auto" w:fill="F2F2F2"/>
-      </w:pPr>
-      <w:r>
-        <w:rPr>
-          <w:rFonts w:ascii="Courier New" w:hAnsi="Courier New"/>
-          <w:color w:val="C7254E"/>
-          <w:sz w:val="18"/>
-        </w:rPr>
-        <w:t>pnpm --filter @workspace/relay-daemon run build</w:t>
-      </w:r>
-    </w:p>
-    <w:p>
-      <w:pPr>
-        <w:pStyle w:val="NoSpacing"/>
-        <w:ind w:left="454"/>
-        <w:shd w:val="clear" w:color="auto" w:fill="F2F2F2"/>
-      </w:pPr>
-      <w:r>
-        <w:rPr>
-          <w:rFonts w:ascii="Courier New" w:hAnsi="Courier New"/>
-          <w:color w:val="C7254E"/>
-          <w:sz w:val="18"/>
-        </w:rPr>
-        <w:t>Stop-ScheduledTask -TaskName "eQSO Relay CB"</w:t>
-      </w:r>
-    </w:p>
-    <w:p>
-      <w:pPr>
-        <w:pStyle w:val="NoSpacing"/>
-        <w:ind w:left="454"/>
-        <w:shd w:val="clear" w:color="auto" w:fill="F2F2F2"/>
-      </w:pPr>
-      <w:r>
-        <w:rPr>
-          <w:rFonts w:ascii="Courier New" w:hAnsi="Courier New"/>
-          <w:color w:val="C7254E"/>
-          <w:sz w:val="18"/>
-        </w:rPr>
-        <w:t>Start-ScheduledTask -TaskName "eQSO Relay CB"</w:t>
-      </w:r>
-    </w:p>
-    <w:p>
-      <w:r>
-        <w:br w:type="page"/>
+        <w:t>Para actualizar, vuelve a ejecutar el lanzador. También puede hacerse manualmente desde %USERPROFILE%\eqso-linux, instalando dependencias, compilando y reiniciando la tarea.</w:t>
       </w:r>
     </w:p>
     <w:p>
@@ -2002,12 +1578,7 @@
         <w:shd w:val="clear" w:color="auto" w:fill="F2F2F2"/>
       </w:pPr>
       <w:r>
-        <w:rPr>
-          <w:rFonts w:ascii="Courier New" w:hAnsi="Courier New"/>
-          <w:color w:val="C7254E"/>
-          <w:sz w:val="18"/>
-        </w:rPr>
-        <w:t xml:space="preserve">    "playbackFormat": "wasapi",</w:t>
+        <w:t xml:space="preserve">    "playbackFormat": "ffplay",</w:t>
       </w:r>
     </w:p>
     <w:p>
@@ -2763,12 +2334,8 @@
             <w:tcW w:w="5840" w:type="dxa"/>
           </w:tcPr>
           <w:p>
-            <w:r/>
             <w:r>
-              <w:rPr>
-                <w:sz w:val="20"/>
-              </w:rPr>
-              <w:t>Dispositivo de captura ALSA (Linux) o nombre dshow/wasapi (Windows)</w:t>
+              <w:t>Dispositivo de captura ALSA (Linux) o nombre DirectShow (Windows)</w:t>
             </w:r>
           </w:p>
         </w:tc>
@@ -2913,12 +2480,8 @@
             <w:tcW w:w="5840" w:type="dxa"/>
           </w:tcPr>
           <w:p>
-            <w:r/>
             <w:r>
-              <w:rPr>
-                <w:sz w:val="20"/>
-              </w:rPr>
-              <w:t>Solo backend ffmpeg: "wasapi" (Win), "alsa" (Linux), "coreaudio" (Mac)</w:t>
+              <w:t>Solo backend ffmpeg: "ffplay" (Win), "alsa" (Linux), "coreaudio" (Mac)</w:t>
             </w:r>
           </w:p>
         </w:tc>

</xml_diff>

<commit_message>
Update agent metadata, relay installation guide, and replit documentation
Replit-Commit-Author: Agent
</commit_message>
<xml_diff>
--- a/guia_relay_instalacion.docx
+++ b/guia_relay_instalacion.docx
@@ -309,6 +309,22 @@
       </w:r>
     </w:p>
     <w:p>
+      <w:hyperlink r:id="rId9">
+        <w:r>
+          <w:rPr>
+            <w:color w:val="0563C1"/>
+            <w:u w:val="single"/>
+          </w:rPr>
+          <w:t>https://github.com/daycart/eqso-linux/raw/refs/heads/main/artifacts/relay-daemon/install/install-relay.sh</w:t>
+        </w:r>
+      </w:hyperlink>
+    </w:p>
+    <w:p>
+      <w:r>
+        <w:t>Descarga directa del instalador:</w:t>
+      </w:r>
+    </w:p>
+    <w:p>
       <w:pPr>
         <w:pStyle w:val="NoSpacing"/>
       </w:pPr>
@@ -803,19 +819,38 @@
     <w:p>
       <w:pPr/>
       <w:r>
-        <w:t>Descarga install-relay-windows.cmd desde la carpeta de instalación del repositorio:</w:t>
+        <w:t>Descarga el ZIP del lanzador de Windows:</w:t>
       </w:r>
     </w:p>
     <w:p>
+      <w:r>
+        <w:t>Enlace directo al archivo .cmd:</w:t>
+      </w:r>
+    </w:p>
+    <w:p>
+      <w:hyperlink r:id="rId11">
+        <w:r>
+          <w:rPr>
+            <w:color w:val="0563C1"/>
+            <w:u w:val="single"/>
+          </w:rPr>
+          <w:t>https://github.com/daycart/eqso-linux/raw/refs/heads/test/windows-relay-installer/artifacts/relay-daemon/install/install-relay-windows.cmd</w:t>
+        </w:r>
+      </w:hyperlink>
+    </w:p>
+    <w:p>
       <w:pPr>
         <w:pStyle w:val="NoSpacing"/>
       </w:pPr>
-      <w:r>
-        <w:rPr>
-          <w:rFonts w:ascii="Consolas" w:hAnsi="Consolas" w:eastAsia="Consolas"/>
-        </w:rPr>
-        <w:t>https://github.com/daycart/eqso-linux/tree/test/windows-relay-installer/artifacts/relay-daemon/install</w:t>
-      </w:r>
+      <w:hyperlink r:id="rId10">
+        <w:r>
+          <w:rPr>
+            <w:color w:val="0563C1"/>
+            <w:u w:val="single"/>
+          </w:rPr>
+          <w:t>https://github.com/daycart/eqso-linux/raw/refs/heads/test/windows-relay-installer/artifacts/relay-daemon/install/install-relay-windows.zip</w:t>
+        </w:r>
+      </w:hyperlink>
     </w:p>
     <w:p>
       <w:pPr/>

</xml_diff>

<commit_message>
Update relay installation documentation and add reference screenshot
Replit-Commit-Author: Agent
</commit_message>
<xml_diff>
--- a/guia_relay_instalacion.docx
+++ b/guia_relay_instalacion.docx
@@ -33,7 +33,7 @@
         <w:jc w:val="center"/>
       </w:pPr>
       <w:r>
-        <w:t>Versión 1.4 — Agosto 2026</w:t>
+        <w:t>Versión 1.5 — Agosto 2026</w:t>
       </w:r>
     </w:p>
     <w:p>
@@ -685,119 +685,178 @@
       </w:r>
     </w:p>
     <w:p>
-      <w:pPr>
-        <w:pStyle w:val="NoSpacing"/>
-      </w:pPr>
-      <w:r>
-        <w:rPr>
-          <w:rFonts w:ascii="Consolas" w:hAnsi="Consolas" w:eastAsia="Consolas"/>
-        </w:rPr>
+      <w:r>
+        <w:t>Sustituye CB por el nombre real de la sala. El servicio se llama eqso-relay@&lt;SALA&gt; y está gestionado por systemd.</w:t>
+      </w:r>
+    </w:p>
+    <w:p>
+      <w:r>
+        <w:t>Actualizar el software</w:t>
+      </w:r>
+    </w:p>
+    <w:p>
+      <w:r>
+        <w:t>Usa estos pasos cuando quieras traer una versión nueva del repositorio:</w:t>
+      </w:r>
+    </w:p>
+    <w:p>
+      <w:r>
         <w:t>cd ~/eqso-linux-client</w:t>
       </w:r>
     </w:p>
     <w:p>
-      <w:pPr>
-        <w:pStyle w:val="NoSpacing"/>
-      </w:pPr>
-      <w:r>
-        <w:rPr>
-          <w:rFonts w:ascii="Consolas" w:hAnsi="Consolas" w:eastAsia="Consolas"/>
-        </w:rPr>
+      <w:r>
         <w:t>git pull</w:t>
       </w:r>
     </w:p>
     <w:p>
-      <w:pPr>
-        <w:pStyle w:val="NoSpacing"/>
-      </w:pPr>
-      <w:r>
-        <w:rPr>
-          <w:rFonts w:ascii="Consolas" w:hAnsi="Consolas" w:eastAsia="Consolas"/>
-        </w:rPr>
+      <w:r>
         <w:t>pnpm install</w:t>
       </w:r>
     </w:p>
     <w:p>
-      <w:pPr>
-        <w:pStyle w:val="NoSpacing"/>
-      </w:pPr>
-      <w:r>
-        <w:rPr>
-          <w:rFonts w:ascii="Consolas" w:hAnsi="Consolas" w:eastAsia="Consolas"/>
-        </w:rPr>
+      <w:r>
         <w:t>pnpm --filter @workspace/relay-daemon run build</w:t>
       </w:r>
     </w:p>
     <w:p>
-      <w:pPr>
-        <w:pStyle w:val="NoSpacing"/>
-      </w:pPr>
-      <w:r>
-        <w:rPr>
-          <w:rFonts w:ascii="Consolas" w:hAnsi="Consolas" w:eastAsia="Consolas"/>
-        </w:rPr>
+      <w:r>
         <w:t>sudo systemctl restart eqso-relay@CB</w:t>
       </w:r>
     </w:p>
     <w:p>
-      <w:pPr/>
+      <w:r>
+        <w:t>Qué hace cada comando:</w:t>
+      </w:r>
+    </w:p>
+    <w:p>
+      <w:r>
+        <w:t>• cd entra en la copia local del proyecto donde está instalado el relay.</w:t>
+      </w:r>
+    </w:p>
+    <w:p>
+      <w:r>
+        <w:t>• git pull descarga los cambios publicados en GitHub. No reinicia el servicio por sí solo.</w:t>
+      </w:r>
+    </w:p>
+    <w:p>
+      <w:r>
+        <w:t>• pnpm install instala o actualiza las dependencias que necesita el proyecto.</w:t>
+      </w:r>
+    </w:p>
+    <w:p>
+      <w:r>
+        <w:t>• pnpm ... build compila el relay daemon que ejecutará systemd.</w:t>
+      </w:r>
+    </w:p>
+    <w:p>
+      <w:r>
+        <w:t>• systemctl restart detiene la versión anterior y arranca la nueva. También aplica los cambios del archivo JSON.</w:t>
+      </w:r>
+    </w:p>
+    <w:p>
       <w:r>
         <w:t>La configuración está en /etc/eqso-relay/CB.json. Después de modificarla, reinicia el servicio para aplicar los cambios.</w:t>
       </w:r>
     </w:p>
     <w:p>
-      <w:pPr>
-        <w:pStyle w:val="NoSpacing"/>
-      </w:pPr>
-      <w:r>
-        <w:rPr>
-          <w:rFonts w:ascii="Consolas" w:hAnsi="Consolas" w:eastAsia="Consolas"/>
-        </w:rPr>
+      <w:r>
+        <w:t>Consultar el estado y los registros</w:t>
+      </w:r>
+    </w:p>
+    <w:p>
+      <w:r>
         <w:t>sudo systemctl status eqso-relay@CB</w:t>
       </w:r>
     </w:p>
     <w:p>
-      <w:pPr>
-        <w:pStyle w:val="NoSpacing"/>
-      </w:pPr>
-      <w:r>
-        <w:rPr>
-          <w:rFonts w:ascii="Consolas" w:hAnsi="Consolas" w:eastAsia="Consolas"/>
-        </w:rPr>
+      <w:r>
+        <w:t>Muestra si el relay está activo, su PID, el tiempo que lleva funcionando y las últimas líneas del servicio. Solo consulta; no cambia nada.</w:t>
+      </w:r>
+    </w:p>
+    <w:p>
+      <w:r>
         <w:t>sudo journalctl -u eqso-relay@CB -f</w:t>
       </w:r>
     </w:p>
     <w:p>
-      <w:pPr>
-        <w:pStyle w:val="NoSpacing"/>
-      </w:pPr>
-      <w:r>
-        <w:rPr>
-          <w:rFonts w:ascii="Consolas" w:hAnsi="Consolas" w:eastAsia="Consolas"/>
-        </w:rPr>
+      <w:r>
+        <w:t>Muestra en tiempo real los mensajes del relay, incluidos errores de audio, conexión, VOX y PTT. Pulsa Ctrl+C para dejar de verlos; el relay sigue funcionando.</w:t>
+      </w:r>
+    </w:p>
+    <w:p>
+      <w:r>
+        <w:t>curl http://127.0.0.1:8009/status</w:t>
+      </w:r>
+    </w:p>
+    <w:p>
+      <w:r>
+        <w:t>Consulta el estado HTTP local del daemon y sus contadores TX/RX. No reinicia ni modifica el servicio.</w:t>
+      </w:r>
+    </w:p>
+    <w:p>
+      <w:r>
+        <w:t>Parar, iniciar y reiniciar</w:t>
+      </w:r>
+    </w:p>
+    <w:p>
+      <w:r>
         <w:t>sudo systemctl stop eqso-relay@CB</w:t>
       </w:r>
     </w:p>
     <w:p>
-      <w:pPr>
-        <w:pStyle w:val="NoSpacing"/>
-      </w:pPr>
-      <w:r>
-        <w:rPr>
-          <w:rFonts w:ascii="Consolas" w:hAnsi="Consolas" w:eastAsia="Consolas"/>
-        </w:rPr>
+      <w:r>
+        <w:t>Detiene temporalmente el relay para hacer mantenimiento. El servicio sigue instalado y, al ser una parada manual, no se reinicia automáticamente.</w:t>
+      </w:r>
+    </w:p>
+    <w:p>
+      <w:r>
+        <w:t>sudo systemctl start eqso-relay@CB</w:t>
+      </w:r>
+    </w:p>
+    <w:p>
+      <w:r>
+        <w:t>Arranca un relay que estaba parado, sin recompilar ni modificar la configuración.</w:t>
+      </w:r>
+    </w:p>
+    <w:p>
+      <w:r>
         <w:t>sudo systemctl restart eqso-relay@CB</w:t>
       </w:r>
     </w:p>
     <w:p>
-      <w:pPr>
-        <w:pStyle w:val="NoSpacing"/>
-      </w:pPr>
-      <w:r>
-        <w:rPr>
-          <w:rFonts w:ascii="Consolas" w:hAnsi="Consolas" w:eastAsia="Consolas"/>
-        </w:rPr>
-        <w:t>curl http://127.0.0.1:8009/status</w:t>
+      <w:r>
+        <w:t>Hace stop y start seguidos. Es el comando indicado después de cambiar el JSON o compilar una versión nueva.</w:t>
+      </w:r>
+    </w:p>
+    <w:p>
+      <w:r>
+        <w:t>Activar el arranque automático después de reiniciar la Raspberry Pi:</w:t>
+      </w:r>
+    </w:p>
+    <w:p>
+      <w:r>
+        <w:t>sudo systemctl enable eqso-relay@CB</w:t>
+      </w:r>
+    </w:p>
+    <w:p>
+      <w:r>
+        <w:t>Registra el servicio para que se inicie con systemd en el siguiente arranque, pero no lo inicia ahora.</w:t>
+      </w:r>
+    </w:p>
+    <w:p>
+      <w:r>
+        <w:t>Para registrarlo y arrancarlo inmediatamente:</w:t>
+      </w:r>
+    </w:p>
+    <w:p>
+      <w:r>
+        <w:t>sudo systemctl enable --now eqso-relay@CB</w:t>
+      </w:r>
+    </w:p>
+    <w:p>
+      <w:r>
+        <w:t>Sustituye CB por la sala real en todos los comandos. Si solo quieres ver los logs, Ctrl+C cierra únicamente la vista del log y no detiene el relay.</w:t>
       </w:r>
     </w:p>
     <w:p>
@@ -990,70 +1049,98 @@
       </w:r>
     </w:p>
     <w:p>
-      <w:pPr/>
-      <w:r>
-        <w:t>El log de la tarea se guarda en C:\eqso-relay\relay-&lt;SALA&gt;.log. Sustituye CB por el nombre real de la sala.</w:t>
-      </w:r>
-    </w:p>
-    <w:p>
-      <w:pPr>
-        <w:pStyle w:val="NoSpacing"/>
-      </w:pPr>
-      <w:r>
-        <w:rPr>
-          <w:rFonts w:ascii="Consolas" w:hAnsi="Consolas" w:eastAsia="Consolas"/>
-        </w:rPr>
+      <w:r>
+        <w:t>Sustituye CB por el nombre real de la sala. La instalación crea la tarea programada eQSO Relay CB, el archivo C:\eqso-relay\CB.json y el log C:\eqso-relay\relay-CB.log.</w:t>
+      </w:r>
+    </w:p>
+    <w:p>
+      <w:r>
+        <w:t>Consultar el log en tiempo real</w:t>
+      </w:r>
+    </w:p>
+    <w:p>
+      <w:r>
         <w:t>Get-Content "C:\eqso-relay\relay-CB.log" -Wait -Tail 20</w:t>
       </w:r>
     </w:p>
     <w:p>
-      <w:pPr>
-        <w:pStyle w:val="NoSpacing"/>
-      </w:pPr>
-      <w:r>
-        <w:rPr>
-          <w:rFonts w:ascii="Consolas" w:hAnsi="Consolas" w:eastAsia="Consolas"/>
-        </w:rPr>
+      <w:r>
+        <w:t>Muestra las últimas 20 líneas y, gracias a -Wait, sigue mostrando las nuevas líneas a medida que se escriben. Pulsa Ctrl+C para salir de la vista; no detiene el relay.</w:t>
+      </w:r>
+    </w:p>
+    <w:p>
+      <w:r>
+        <w:t>Parar el relay</w:t>
+      </w:r>
+    </w:p>
+    <w:p>
+      <w:r>
         <w:t>Stop-ScheduledTask -TaskName "eQSO Relay CB"</w:t>
       </w:r>
     </w:p>
     <w:p>
-      <w:pPr>
-        <w:pStyle w:val="NoSpacing"/>
-      </w:pPr>
-      <w:r>
-        <w:rPr>
-          <w:rFonts w:ascii="Consolas" w:hAnsi="Consolas" w:eastAsia="Consolas"/>
-        </w:rPr>
+      <w:r>
+        <w:t>Detiene el proceso actual del relay. La tarea sigue registrada, y no se borran ni la configuración, ni los logs, ni el código descargado.</w:t>
+      </w:r>
+    </w:p>
+    <w:p>
+      <w:r>
+        <w:t>Iniciar el relay</w:t>
+      </w:r>
+    </w:p>
+    <w:p>
+      <w:r>
         <w:t>Start-ScheduledTask -TaskName "eQSO Relay CB"</w:t>
       </w:r>
     </w:p>
     <w:p>
-      <w:pPr>
-        <w:pStyle w:val="NoSpacing"/>
-      </w:pPr>
-      <w:r>
-        <w:rPr>
-          <w:rFonts w:ascii="Consolas" w:hAnsi="Consolas" w:eastAsia="Consolas"/>
-        </w:rPr>
+      <w:r>
+        <w:t>Arranca la tarea programada registrada. Es útil después de una parada manual o para iniciar una instalación que se dejó detenida en modo máquina virtual.</w:t>
+      </w:r>
+    </w:p>
+    <w:p>
+      <w:r>
+        <w:t>Reiniciar el relay</w:t>
+      </w:r>
+    </w:p>
+    <w:p>
+      <w:r>
         <w:t>Stop-ScheduledTask -TaskName "eQSO Relay CB"; Start-ScheduledTask -TaskName "eQSO Relay CB"</w:t>
       </w:r>
     </w:p>
     <w:p>
-      <w:pPr>
-        <w:pStyle w:val="NoSpacing"/>
-      </w:pPr>
-      <w:r>
-        <w:rPr>
-          <w:rFonts w:ascii="Consolas" w:hAnsi="Consolas" w:eastAsia="Consolas"/>
-        </w:rPr>
+      <w:r>
+        <w:t>Ejecuta una parada y un inicio seguidos. Úsalo después de modificar C:\eqso-relay\CB.json o de actualizar y recompilar el código.</w:t>
+      </w:r>
+    </w:p>
+    <w:p>
+      <w:r>
+        <w:t>Actualizar el software</w:t>
+      </w:r>
+    </w:p>
+    <w:p>
+      <w:r>
+        <w:t>La forma recomendada es volver a ejecutar install-relay-windows.cmd como Administrador. El lanzador actualiza el repositorio y recompila el daemon. Después, inicia la tarea si la instalación es para un PC físico.</w:t>
+      </w:r>
+    </w:p>
+    <w:p>
+      <w:r>
+        <w:t>Quitar el arranque automático</w:t>
+      </w:r>
+    </w:p>
+    <w:p>
+      <w:r>
         <w:t>Unregister-ScheduledTask -TaskName "eQSO Relay CB" -Confirm:$false</w:t>
       </w:r>
     </w:p>
     <w:p>
-      <w:pPr/>
-      <w:r>
-        <w:t>Para actualizar, vuelve a ejecutar el lanzador. También puede hacerse manualmente desde %USERPROFILE%\eqso-linux, instalando dependencias, compilando y reiniciando la tarea.</w:t>
+      <w:r>
+        <w:t>Elimina la tarea del Programador de tareas y deja de iniciarse automáticamente al iniciar sesión. No borra el JSON, los logs ni el código descargado. Para volver a registrarla hay que ejecutar de nuevo el instalador.</w:t>
+      </w:r>
+    </w:p>
+    <w:p>
+      <w:r>
+        <w:t>Si solo quieres detenerlo temporalmente, utiliza Stop-ScheduledTask; no uses Unregister-ScheduledTask.</w:t>
       </w:r>
     </w:p>
     <w:p>

</xml_diff>

<commit_message>
Update relay installer assets and documentation
Replit-Commit-Author: Agent
</commit_message>
<xml_diff>
--- a/guia_relay_instalacion.docx
+++ b/guia_relay_instalacion.docx
@@ -33,7 +33,7 @@
         <w:jc w:val="center"/>
       </w:pPr>
       <w:r>
-        <w:t>Versión 1.5 — Agosto 2026</w:t>
+        <w:t>Versión 1.6 — Agosto 2026</w:t>
       </w:r>
     </w:p>
     <w:p>
@@ -1055,6 +1055,11 @@
     </w:p>
     <w:p>
       <w:r>
+        <w:t>El instalador crea el archivo de log antes de arrancar la tarea. El script de arranque añade una línea de inicio y otra de finalización con el código de salida; así también queda registrado un error de Node, audio o ruta.</w:t>
+      </w:r>
+    </w:p>
+    <w:p>
+      <w:r>
         <w:t>Consultar el log en tiempo real</w:t>
       </w:r>
     </w:p>
@@ -1066,6 +1071,31 @@
     <w:p>
       <w:r>
         <w:t>Muestra las últimas 20 líneas y, gracias a -Wait, sigue mostrando las nuevas líneas a medida que se escriben. Pulsa Ctrl+C para salir de la vista; no detiene el relay.</w:t>
+      </w:r>
+    </w:p>
+    <w:p>
+      <w:r>
+        <w:t>Para comprobar si existe el archivo y cuándo se ejecutó la tarea:</w:t>
+      </w:r>
+    </w:p>
+    <w:p>
+      <w:r>
+        <w:t>Test-Path "C:\eqso-relay\relay-CB.log"</w:t>
+      </w:r>
+    </w:p>
+    <w:p>
+      <w:r>
+        <w:t>Get-ScheduledTaskInfo -TaskName "eQSO Relay CB"</w:t>
+      </w:r>
+    </w:p>
+    <w:p>
+      <w:r>
+        <w:t>Test-Path devuelve True si el archivo existe. Get-ScheduledTaskInfo muestra la última ejecución y el código de resultado de la tarea. Si el log no existe después de instalar, vuelve a ejecutar el instalador actualizado como Administrador.</w:t>
+      </w:r>
+    </w:p>
+    <w:p>
+      <w:r>
+        <w:t>La sintaxis correcta es Get-Content "C:\..."; Get-C:\... no es un comando válido de PowerShell.</w:t>
       </w:r>
     </w:p>
     <w:p>

</xml_diff>

<commit_message>
Update relay daemon installation scripts and documentation
Replit-Commit-Author: Agent
</commit_message>
<xml_diff>
--- a/guia_relay_instalacion.docx
+++ b/guia_relay_instalacion.docx
@@ -33,7 +33,7 @@
         <w:jc w:val="center"/>
       </w:pPr>
       <w:r>
-        <w:t>Versión 1.6 — Agosto 2026</w:t>
+        <w:t>Versión 1.7 — Agosto 2026</w:t>
       </w:r>
     </w:p>
     <w:p>
@@ -1038,6 +1038,11 @@
       </w:pPr>
       <w:r>
         <w:t>La tarea se reinicia automáticamente si el proceso falla. En PC físico se inicia inmediatamente; en VM queda registrada pero detenida.</w:t>
+      </w:r>
+    </w:p>
+    <w:p>
+      <w:r>
+        <w:t>La tarea utiliza un lanzador oculto de Windows para que el daemon funcione en segundo plano sin dejar una ventana CMD en primer plano. Si se abre manualmente start-&lt;SALA&gt;.cmd, sí es normal que la ventana permanezca abierta mientras el daemon está funcionando.</w:t>
       </w:r>
     </w:p>
     <w:p>

</xml_diff>

<commit_message>
Update relay installation script and assets
Replit-Commit-Author: Agent
</commit_message>
<xml_diff>
--- a/guia_relay_instalacion.docx
+++ b/guia_relay_instalacion.docx
@@ -33,7 +33,7 @@
         <w:jc w:val="center"/>
       </w:pPr>
       <w:r>
-        <w:t>Versión 1.7 — Agosto 2026</w:t>
+        <w:t>Versión 1.8 — Agosto 2026</w:t>
       </w:r>
     </w:p>
     <w:p>
@@ -907,7 +907,7 @@
             <w:color w:val="0563C1"/>
             <w:u w:val="single"/>
           </w:rPr>
-          <w:t>https://github.com/daycart/eqso-linux/raw/refs/heads/test/windows-relay-installer/artifacts/relay-daemon/install/install-relay-windows-v1.7.zip</w:t>
+          <w:t>https://github.com/daycart/eqso-linux/raw/refs/heads/test/windows-relay-installer/artifacts/relay-daemon/install/install-relay-windows-v1.8.zip</w:t>
         </w:r>
       </w:hyperlink>
     </w:p>
@@ -1110,12 +1110,17 @@
     </w:p>
     <w:p>
       <w:r>
-        <w:t>Stop-ScheduledTask -TaskName "eQSO Relay CB"</w:t>
-      </w:r>
-    </w:p>
-    <w:p>
-      <w:r>
-        <w:t>Detiene el proceso actual del relay. La tarea sigue registrada, y no se borran ni la configuración, ni los logs, ni el código descargado.</w:t>
+        <w:t>powershell.exe -ExecutionPolicy Bypass -File "C:\eqso-relay\stop-CB.ps1"</w:t>
+      </w:r>
+    </w:p>
+    <w:p>
+      <w:r>
+        <w:t>Detiene la tarea y también el proceso node.exe de esta sala, junto con sus procesos de audio FFmpeg/FFplay. La tarea sigue registrada y no se borran la configuración ni los logs.</w:t>
+      </w:r>
+    </w:p>
+    <w:p>
+      <w:r>
+        <w:t>No utilices Stop-ScheduledTask por sí solo con el lanzador oculto: puede detener la tarea de Windows y dejar vivo el proceso hijo, haciendo que el log continúe recibiendo datos.</w:t>
       </w:r>
     </w:p>
     <w:p>
@@ -1140,12 +1145,12 @@
     </w:p>
     <w:p>
       <w:r>
-        <w:t>Stop-ScheduledTask -TaskName "eQSO Relay CB"; Start-ScheduledTask -TaskName "eQSO Relay CB"</w:t>
-      </w:r>
-    </w:p>
-    <w:p>
-      <w:r>
-        <w:t>Ejecuta una parada y un inicio seguidos. Úsalo después de modificar C:\eqso-relay\CB.json o de actualizar y recompilar el código.</w:t>
+        <w:t>powershell.exe -ExecutionPolicy Bypass -File "C:\eqso-relay\stop-CB.ps1"; Start-ScheduledTask -TaskName "eQSO Relay CB"</w:t>
+      </w:r>
+    </w:p>
+    <w:p>
+      <w:r>
+        <w:t>Ejecuta la parada completa y vuelve a iniciar la tarea. Úsalo después de modificar C:\eqso-relay\CB.json o de actualizar y recompilar el código.</w:t>
       </w:r>
     </w:p>
     <w:p>
@@ -1165,17 +1170,17 @@
     </w:p>
     <w:p>
       <w:r>
-        <w:t>Unregister-ScheduledTask -TaskName "eQSO Relay CB" -Confirm:$false</w:t>
-      </w:r>
-    </w:p>
-    <w:p>
-      <w:r>
-        <w:t>Elimina la tarea del Programador de tareas y deja de iniciarse automáticamente al iniciar sesión. No borra el JSON, los logs ni el código descargado. Para volver a registrarla hay que ejecutar de nuevo el instalador.</w:t>
-      </w:r>
-    </w:p>
-    <w:p>
-      <w:r>
-        <w:t>Si solo quieres detenerlo temporalmente, utiliza Stop-ScheduledTask; no uses Unregister-ScheduledTask.</w:t>
+        <w:t>powershell.exe -ExecutionPolicy Bypass -File "C:\eqso-relay\stop-CB.ps1"; Unregister-ScheduledTask -TaskName "eQSO Relay CB" -Confirm:$false</w:t>
+      </w:r>
+    </w:p>
+    <w:p>
+      <w:r>
+        <w:t>Primero detiene el daemon y sus procesos de audio; después elimina la tarea del Programador de tareas. No borra el JSON, los logs ni el código descargado. Para volver a registrarla hay que ejecutar de nuevo el instalador.</w:t>
+      </w:r>
+    </w:p>
+    <w:p>
+      <w:r>
+        <w:t>Para detenerlo temporalmente utiliza siempre stop-CB.ps1; no uses Unregister-ScheduledTask salvo que quieras quitar también la tarea programada.</w:t>
       </w:r>
     </w:p>
     <w:p>

</xml_diff>